<commit_message>
Demo data: use securemind.chat for the made-up email address
The sample documents and regression corpus used a northwind-industries.io
address, a domain someone else could own. They now use jordan.hale@securemind.chat.
Test files regenerated with npm run corpus:write.

Co-Authored-By: Claude Sonnet 5.5 <noreply@anthropic.com>
</commit_message>
<xml_diff>
--- a/docs/test-files/SecureMind_Synthetic_Utility_Invoice.docx
+++ b/docs/test-files/SecureMind_Synthetic_Utility_Invoice.docx
@@ -29,12 +29,12 @@
     </w:p>
     <w:p>
       <w:r>
-        <w:t xml:space="preserve">Bill-to: Jordan Hale    Email: jordan.hale@northwind-industries.io    Phone: (415) 555-0142</w:t>
+        <w:t xml:space="preserve">Bill-to: Jordan Hale    Email: jordan.hale@securemind.chat    Phone: (415) 555-0142</w:t>
       </w:r>
     </w:p>
     <w:p>
       <w:r>
-        <w:t xml:space="preserve">Repeat notice copy: jordan.hale@northwind-industries.io</w:t>
+        <w:t xml:space="preserve">Repeat notice copy: jordan.hale@securemind.chat</w:t>
       </w:r>
     </w:p>
     <w:p>

</xml_diff>